<commit_message>
Docs for survey 6.4 / recommendation 6.5 (S4 two interests)
- Spec MD/JSON/Word: S4 two picks, branch rules, type_max_raw, interest
  mean, night trigger, reserved regional slots, new demo tables
- Questionnaire MD/Word, respondent form Word/PNG (S4 checkboxes),
  branch-flow figure
- README survey logic, recommendation example and 6.4 metrics;
  implementation README and source comparison
- Release notes, verification records and manifest

Co-Authored-By: Claude Opus 5.5 <noreply@anthropic.com>
Claude-Session: https://claude.ai/code/session_01U2znPGm3mBPJ99vgtQRoQ3
</commit_message>
<xml_diff>
--- a/docs/Tour_Navigator_Cosine_Specification.docx
+++ b/docs/Tour_Navigator_Cosine_Specification.docx
@@ -22,7 +22,7 @@
     </w:p>
     <w:p>
       <w:r>
-        <w:t>공통 6문항 + 관심사 분기 1문항 + 조건부 확인 문항</w:t>
+        <w:t>공통 6문항(S4는 관심사 두 가지) + 관심사 분기 1~2문항 + 조건부 확인 문항</w:t>
         <w:br/>
         <w:t>B1~B7의 D 없음: 모든 유형 0점</w:t>
         <w:br/>
@@ -34,7 +34,7 @@
         <w:pStyle w:val="Heading2"/>
       </w:pPr>
       <w:r>
-        <w:t>버전 integrated 6.4   |   2026.09.29</w:t>
+        <w:t>버전 integrated 6.5   |   2026.09.29</w:t>
       </w:r>
     </w:p>
     <w:p>
@@ -560,7 +560,7 @@
     </w:p>
     <w:p>
       <w:r>
-        <w:t>이 명세서는 최신 분기형 설문 6.3을 기준으로 질문별 점수, C 유형 판정, 테마 추천, 지역 시티투어, 관광지·코스 군집, PCA, 코사인 유사도와 체류 산정을 하나의 흐름으로 설명한다. 문서 버전은 integrated 6.4이며 신규 설문에서 추천까지 연결하는 참조 계산 코드를 함께 제공한다.</w:t>
+        <w:t>이 명세서는 최신 분기형 설문 6.4를 기준으로 질문별 점수, C 유형 판정, 테마 추천, 지역 시티투어, 관광지·코스 군집, PCA, 코사인 유사도와 체류 산정을 하나의 흐름으로 설명한다. 문서 버전은 integrated 6.5이며 신규 설문에서 추천까지 연결하는 참조 계산 코드를 함께 제공한다.</w:t>
       </w:r>
     </w:p>
     <w:tbl>
@@ -632,7 +632,7 @@
               <w:rPr>
                 <w:sz w:val="18"/>
               </w:rPr>
-              <w:t>신규 설문 6.3</w:t>
+              <w:t>신규 설문 6.4</w:t>
             </w:r>
           </w:p>
         </w:tc>
@@ -648,7 +648,7 @@
               <w:rPr>
                 <w:sz w:val="18"/>
               </w:rPr>
-              <w:t>공통 S1~S6 + 관심사별 B1~B7 중 1개 + 필요한 경우 F1. 독립 Python 분류기로 구현. B의 D 없음은 전 유형 0점. 6.3에서 유형 점수를 유형별 100점 만점으로 환산.</w:t>
+              <w:t>공통 S1~S6(S4는 관심사 두 가지) + 고른 관심사의 B1~B7(1~2개) + 필요한 경우 F1. 독립 Python 분류기로 구현. B의 D 없음은 전 유형 0점. 6.3에서 유형 점수를 유형별 100점 만점으로 환산했고 6.4에서 S4를 두 가지 선택으로 바꿨다.</w:t>
             </w:r>
           </w:p>
         </w:tc>
@@ -669,7 +669,7 @@
               <w:rPr>
                 <w:sz w:val="18"/>
               </w:rPr>
-              <w:t>6.4 추천 연결</w:t>
+              <w:t>6.5 추천 연결</w:t>
             </w:r>
           </w:p>
         </w:tc>
@@ -685,7 +685,7 @@
               <w:rPr>
                 <w:sz w:val="18"/>
               </w:rPr>
-              <w:t>최종 C 점수 → 5범주 간접 선호 → 테마 지수와 시티투어 순위. 코스 점수에 S4 관심사·야경·여행 속도 가산을 추가. 이번 참조 코드에서 계산 예제를 확인. 실제 이용자 평가·운영 앱 배포는 별도.</w:t>
+              <w:t>최종 C 점수 → 5범주 간접 선호 → 테마 지수와 시티투어 순위. 코스 점수에 S4 관심사(두 관심사의 평균)·야경·여행 속도 가산, 지역 대표 5개에 관심사별 1자리 보장. 이번 참조 코드에서 계산 예제를 확인. 실제 이용자 평가·운영 앱 배포는 별도.</w:t>
             </w:r>
           </w:p>
         </w:tc>
@@ -759,7 +759,7 @@
               <w:rPr>
                 <w:sz w:val="18"/>
               </w:rPr>
-              <w:t>한류·연령·성별 주변비율·지역 보정의 산식과 활용 조건을 보존. 신규 설문만으로 필수 입력을 확보할 수 없어 6.4 참조 추천에서는 가산 0.</w:t>
+              <w:t>한류·연령·성별 주변비율·지역 보정의 산식과 활용 조건을 보존. 신규 설문만으로 필수 입력을 확보할 수 없어 6.5 참조 추천에서는 가산 0.</w:t>
             </w:r>
           </w:p>
         </w:tc>
@@ -1398,7 +1398,7 @@
               <w:rPr>
                 <w:sz w:val="18"/>
               </w:rPr>
-              <w:t>공통 6문항을 한 개씩 답한 뒤 S4가 정한 B 1개만 노출</w:t>
+              <w:t>공통 6문항에 답한다(S4는 두 가지). S4의 두 관심사가 정한 B를 번호순으로 노출하고 같은 B는 한 번만</w:t>
             </w:r>
           </w:p>
         </w:tc>
@@ -1451,7 +1451,7 @@
               <w:rPr>
                 <w:sz w:val="18"/>
               </w:rPr>
-              <w:t>1·2위 점수 차가 2 이하이면 F1을 한 번 질문</w:t>
+              <w:t>100점 환산 1·2위 점수 차가 12 이하이면 F1을 한 번 질문</w:t>
             </w:r>
           </w:p>
         </w:tc>
@@ -1467,7 +1467,7 @@
               <w:rPr>
                 <w:sz w:val="18"/>
               </w:rPr>
-              <w:t>7개 또는 8개 응답, 최종 C 후보 집합</w:t>
+              <w:t>7~9개 응답, 최종 C 후보 집합</w:t>
             </w:r>
           </w:p>
         </w:tc>
@@ -1610,7 +1610,7 @@
               <w:rPr>
                 <w:sz w:val="18"/>
               </w:rPr>
-              <w:t>5범주 내적과 S4 범주·야경 보너스로 정렬</w:t>
+              <w:t>5범주 내적과 S4 두 관심사의 범주·야경 보너스 평균으로 정렬</w:t>
             </w:r>
           </w:p>
         </w:tc>
@@ -1679,7 +1679,7 @@
               <w:rPr>
                 <w:sz w:val="18"/>
               </w:rPr>
-              <w:t>전체 234개 순위, 같은 지역 1개씩 최대 5개</w:t>
+              <w:t>전체 234개 순위, 같은 지역 1개씩 최대 5개(고른 관심사마다 1자리 보장)</w:t>
             </w:r>
           </w:p>
         </w:tc>
@@ -3547,7 +3547,7 @@
         <w:pStyle w:val="Heading2"/>
       </w:pPr>
       <w:r>
-        <w:t>S4  이번 여행에서 가장 하고 싶은 한 가지는 무엇인가요?</w:t>
+        <w:t>S4  이번 여행에서 가장 하고 싶은 것 두 가지는 무엇인가요?</w:t>
       </w:r>
     </w:p>
     <w:tbl>
@@ -4587,7 +4587,7 @@
     </w:tbl>
     <w:p>
       <w:r>
-        <w:t>S4는 가장 중요한 관심사 한 가지만 받는다. 기존 Q4의 최대 2개 선택과 다르다. S6의 아침·낮·밤은 유형 선호이며 특정 출발 시각이나 실제 운행 시간을 확정하지 않는다.</w:t>
+        <w:t>S4는 서로 다른 관심사 두 가지를 받는다(6.4). 두 선택은 같은 비중이고 순서를 따지지 않으며, 두 선택지의 가산을 모두 더한다. 기존 Q4의 최대 2개 선택과 달리 정확히 두 개를 고른다. S6의 아침·낮·밤은 유형 선호이며 특정 출발 시각이나 실제 운행 시간을 확정하지 않는다.</w:t>
       </w:r>
     </w:p>
     <w:p>
@@ -5162,7 +5162,7 @@
     </w:p>
     <w:p>
       <w:r>
-        <w:t>D를 골라도 현재 1·2위 차가 100점 환산 기준 12점 이하이면 F1은 노출된다. 없음은 이 추가 세부경험 중 선택할 것이 없다는 의미이지 S4 관심사까지 취소한다는 의미가 아니다. S4를 변경하면 이전 B와 F1 응답을 제거하고 새 분기를 다시 계산한다.</w:t>
+        <w:t>D를 골라도 현재 1·2위 차가 100점 환산 기준 12점 이하이면 F1은 노출된다. 없음은 이 추가 세부경험 중 선택할 것이 없다는 의미이지 S4 관심사까지 취소한다는 의미가 아니다. S4를 변경하면 이전 B와 F1 응답을 제거하고 새 분기를 다시 계산한다. S4의 두 관심사가 서로 다른 후속 문항으로 이어지면 두 문항을 번호순으로 모두 묻고, 같은 후속 문항(드라마·공연은 B1, 자연·바다는 B3)이면 한 번만 묻는다.</w:t>
       </w:r>
     </w:p>
     <w:p>
@@ -5173,7 +5173,7 @@
         <w:drawing>
           <wp:inline xmlns:a="http://schemas.openxmlformats.org/drawingml/2006/main" xmlns:pic="http://schemas.openxmlformats.org/drawingml/2006/picture">
             <wp:extent cx="6156000" cy="2421662"/>
-            <wp:docPr id="1" name="Picture 1" descr="분기형 설문 구조. 공통 6문항과 관심사 분기 1문항 뒤, 경계가 겹칠 때만 F1을 추가한다."/>
+            <wp:docPr id="1" name="Picture 1" descr="분기형 설문 구조. 공통 6문항(S4는 두 가지)과 관심사 분기 1~2문항 뒤, 경계가 겹칠 때만 F1을 추가한다."/>
             <wp:cNvGraphicFramePr>
               <a:graphicFrameLocks noChangeAspect="1"/>
             </wp:cNvGraphicFramePr>
@@ -5209,7 +5209,7 @@
         <w:pStyle w:val="Caption"/>
       </w:pPr>
       <w:r>
-        <w:t>분기형 설문 구조. 공통 6문항과 관심사 분기 1문항 뒤, 경계가 겹칠 때만 F1을 추가한다.</w:t>
+        <w:t>분기형 설문 구조. 공통 6문항(S4는 두 가지)과 관심사 분기 1~2문항 뒤, 경계가 겹칠 때만 F1을 추가한다.</w:t>
       </w:r>
     </w:p>
     <w:p>
@@ -5231,7 +5231,7 @@
     </w:p>
     <w:p>
       <w:r>
-        <w:t>노출 조건: S4 A 또는 B. 한 가지만 선택한다.</w:t>
+        <w:t>노출 조건: S4에 A 또는 B가 있음. 한 가지만 선택한다.</w:t>
       </w:r>
     </w:p>
     <w:tbl>
@@ -5529,7 +5529,7 @@
     </w:p>
     <w:p>
       <w:r>
-        <w:t>노출 조건: S4 C. 한 가지만 선택한다.</w:t>
+        <w:t>노출 조건: S4에 C가 있음. 한 가지만 선택한다.</w:t>
       </w:r>
     </w:p>
     <w:tbl>
@@ -5841,7 +5841,7 @@
     </w:p>
     <w:p>
       <w:r>
-        <w:t>노출 조건: S4 D 또는 E. 한 가지만 선택한다.</w:t>
+        <w:t>노출 조건: S4에 D 또는 E가 있음. 한 가지만 선택한다.</w:t>
       </w:r>
     </w:p>
     <w:tbl>
@@ -6139,7 +6139,7 @@
     </w:p>
     <w:p>
       <w:r>
-        <w:t>노출 조건: S4 F. 한 가지만 선택한다.</w:t>
+        <w:t>노출 조건: S4에 F가 있음. 한 가지만 선택한다.</w:t>
       </w:r>
     </w:p>
     <w:tbl>
@@ -6451,7 +6451,7 @@
     </w:p>
     <w:p>
       <w:r>
-        <w:t>노출 조건: S4 G. 한 가지만 선택한다.</w:t>
+        <w:t>노출 조건: S4에 G가 있음. 한 가지만 선택한다.</w:t>
       </w:r>
     </w:p>
     <w:tbl>
@@ -6749,7 +6749,7 @@
     </w:p>
     <w:p>
       <w:r>
-        <w:t>노출 조건: S4 H. 한 가지만 선택한다.</w:t>
+        <w:t>노출 조건: S4에 H가 있음. 한 가지만 선택한다.</w:t>
       </w:r>
     </w:p>
     <w:tbl>
@@ -7047,7 +7047,7 @@
     </w:p>
     <w:p>
       <w:r>
-        <w:t>노출 조건: S4 I. 한 가지만 선택한다.</w:t>
+        <w:t>노출 조건: S4에 I가 있음. 한 가지만 선택한다.</w:t>
       </w:r>
     </w:p>
     <w:tbl>
@@ -7905,7 +7905,7 @@
               <w:rPr>
                 <w:sz w:val="18"/>
               </w:rPr>
-              <w:t>보통 7개, F1 필요 시 8개. 점수 0인 B의 D도 1개로 계산</w:t>
+              <w:t>7~9개(공통 6 + 후속 1~2 + F1). S4는 두 가지를 골라도 1개로 계산하고, 점수 0인 B의 D도 1개로 계산</w:t>
             </w:r>
           </w:p>
         </w:tc>
@@ -8567,7 +8567,7 @@
     </w:p>
     <w:p>
       <w:r>
-        <w:t>Δs는 문항표의 원점수(+1~+4)이고 M_c는 한 경로(공통 S1~S6과 분기 1개)에서 유형 c가 받을 수 있는 최대 원점수다. 원점수 1점은 유형마다 100/M_c점으로 환산되므로, 어느 유형이든 자기에게 가장 유리한 답을 모두 고르면 F1 전 정확히 100점이 된다. f_c는 F1 가산으로 처음부터 100점 척도 값이다(선택한 유형 +20, BALANCED는 20을 후보 수로 나눔). s는 0 이상이며 F1 전에는 100을 넘지 않는다. R은 전체 10개 유형을 설명하는 상대 가중치이며, 최종 E가 1개이면 단일형, 2개 이상이면 복합형이다. 추천에 쓰는 α는 최종 E 안에서 다시 정규화한다. R과 α를 같은 값으로 저장하지 않는다.</w:t>
+        <w:t>Δs는 문항표의 원점수(+1~+4)이고 M_c는 한 경로(공통 S1~S6과 S4 두 관심사의 분기)에서 유형 c가 받을 수 있는 최대 원점수다. 원점수 1점은 유형마다 100/M_c점으로 환산되므로, 어느 유형이든 자기에게 가장 유리한 답을 모두 고르면 F1 전 정확히 100점이 된다. f_c는 F1 가산으로 처음부터 100점 척도 값이다(선택한 유형 +20, BALANCED는 20을 후보 수로 나눔). s는 0 이상이며 F1 전에는 100을 넘지 않는다. R은 전체 10개 유형을 설명하는 상대 가중치이며, 최종 E가 1개이면 단일형, 2개 이상이면 복합형이다. 추천에 쓰는 α는 최종 E 안에서 다시 정규화한다. R과 α를 같은 값으로 저장하지 않는다.</w:t>
       </w:r>
     </w:p>
     <w:tbl>
@@ -8674,7 +8674,7 @@
               <w:rPr>
                 <w:sz w:val="18"/>
               </w:rPr>
-              <w:t>18</w:t>
+              <w:t>23</w:t>
             </w:r>
           </w:p>
         </w:tc>
@@ -8690,7 +8690,7 @@
               <w:rPr>
                 <w:sz w:val="18"/>
               </w:rPr>
-              <w:t>5.56</w:t>
+              <w:t>4.35</w:t>
             </w:r>
           </w:p>
         </w:tc>
@@ -8727,7 +8727,7 @@
               <w:rPr>
                 <w:sz w:val="18"/>
               </w:rPr>
-              <w:t>15</w:t>
+              <w:t>19</w:t>
             </w:r>
           </w:p>
         </w:tc>
@@ -8743,7 +8743,7 @@
               <w:rPr>
                 <w:sz w:val="18"/>
               </w:rPr>
-              <w:t>6.67</w:t>
+              <w:t>5.26</w:t>
             </w:r>
           </w:p>
         </w:tc>
@@ -8780,7 +8780,7 @@
               <w:rPr>
                 <w:sz w:val="18"/>
               </w:rPr>
-              <w:t>16</w:t>
+              <w:t>20</w:t>
             </w:r>
           </w:p>
         </w:tc>
@@ -8796,7 +8796,7 @@
               <w:rPr>
                 <w:sz w:val="18"/>
               </w:rPr>
-              <w:t>6.25</w:t>
+              <w:t>5.00</w:t>
             </w:r>
           </w:p>
         </w:tc>
@@ -8833,7 +8833,7 @@
               <w:rPr>
                 <w:sz w:val="18"/>
               </w:rPr>
-              <w:t>17</w:t>
+              <w:t>19</w:t>
             </w:r>
           </w:p>
         </w:tc>
@@ -8849,7 +8849,7 @@
               <w:rPr>
                 <w:sz w:val="18"/>
               </w:rPr>
-              <w:t>5.88</w:t>
+              <w:t>5.26</w:t>
             </w:r>
           </w:p>
         </w:tc>
@@ -8886,7 +8886,7 @@
               <w:rPr>
                 <w:sz w:val="18"/>
               </w:rPr>
-              <w:t>18</w:t>
+              <w:t>22</w:t>
             </w:r>
           </w:p>
         </w:tc>
@@ -8902,7 +8902,7 @@
               <w:rPr>
                 <w:sz w:val="18"/>
               </w:rPr>
-              <w:t>5.56</w:t>
+              <w:t>4.55</w:t>
             </w:r>
           </w:p>
         </w:tc>
@@ -8992,7 +8992,7 @@
               <w:rPr>
                 <w:sz w:val="18"/>
               </w:rPr>
-              <w:t>14</w:t>
+              <w:t>17</w:t>
             </w:r>
           </w:p>
         </w:tc>
@@ -9008,7 +9008,7 @@
               <w:rPr>
                 <w:sz w:val="18"/>
               </w:rPr>
-              <w:t>7.14</w:t>
+              <w:t>5.88</w:t>
             </w:r>
           </w:p>
         </w:tc>
@@ -9098,7 +9098,7 @@
               <w:rPr>
                 <w:sz w:val="18"/>
               </w:rPr>
-              <w:t>9</w:t>
+              <w:t>11</w:t>
             </w:r>
           </w:p>
         </w:tc>
@@ -9114,7 +9114,7 @@
               <w:rPr>
                 <w:sz w:val="18"/>
               </w:rPr>
-              <w:t>11.11</w:t>
+              <w:t>9.09</w:t>
             </w:r>
           </w:p>
         </w:tc>
@@ -9151,7 +9151,7 @@
               <w:rPr>
                 <w:sz w:val="18"/>
               </w:rPr>
-              <w:t>9</w:t>
+              <w:t>15</w:t>
             </w:r>
           </w:p>
         </w:tc>
@@ -9167,7 +9167,7 @@
               <w:rPr>
                 <w:sz w:val="18"/>
               </w:rPr>
-              <w:t>11.11</w:t>
+              <w:t>6.67</w:t>
             </w:r>
           </w:p>
         </w:tc>
@@ -9193,6 +9193,11 @@
         <w:t>효과: S4 관심사와 1위 코스의 가장 큰 범주가 같은 비율은 역사 0.906→0.948, 자연 0.673→0.705, 음식 0.597→0.792, 바다 0.523→0.749로 올랐고, 체험은 0.547→0.505로 내렸다. 체험을 고르면 C3·C1과 함께 C10이 오르는데, 만점이 9점인 C10이 원점수 2점으로 22점을 받아 역사 쪽 프로필이 더 섞이기 때문이다. 바다를 고른 경로에서 C9가 결과에 포함되는 비율은 40.1%에서 80.0%가 됐다. F1이 필요한 기본 경로는 66.7%에서 49.1%로, 복합 결과는 42.8%에서 35.7%로 줄었고, F1 포함 완료 경로는 141,897개에서 109,552개가 됐다. 이 수치는 모든 선택지가 같은 빈도라고 가정한 구조 점검이며 실제 응답자 분포가 아니다. 실제 관광객 구성과 맞추는 배점 조정은 파일럿 응답으로 다시 해야 한다.</w:t>
       </w:r>
     </w:p>
+    <w:p>
+      <w:r>
+        <w:t>6.4에서 S4를 두 가지 선택으로 바꿨다. 두 관심사의 가산을 모두 더하고 각 관심사의 후속 문항을 묻기 때문에 최대 원점수 M_c가 커졌다(위 표, 6.3은 C1 18 · C2 15 · C3 16 · C4 17 · C5 18 · C6 10 · C7 14 · C8 11 · C9 9 · C10 9). 전수 경로는 S4 조합 36개, 공통+분기 730,296개, F1 포함 완료 1,756,396개다. 응답 수는 7개 0.4%, 8개 20.1%, 9개 79.5%이고, F1이 필요한 기본 경로는 52.0%, 복합 결과는 35.5%다. 유형 비중은 C4 13.8%, C7 12.4%, C1 11.4%, C9 11.3%, C6 10.4%, C8 10.3%, C2 9.5%, C10 7.6%, C5 7.2%, C3 6.1%로 가장 많은 유형과 가장 적은 유형의 비가 2.5배에서 2.3배로 줄었다. 바다를 고른 경로에서 C9가 결과에 포함되는 비율은 56.7%다(바다 하나만 고르던 6.3은 80.0%). 모든 선택지가 같은 빈도라는 가정의 구조 점검이다.</w:t>
+      </w:r>
+    </w:p>
     <w:tbl>
       <w:tblPr>
         <w:tblStyle w:val="TableGrid"/>
@@ -9262,7 +9267,7 @@
               <w:rPr>
                 <w:sz w:val="18"/>
               </w:rPr>
-              <w:t>C4=74.71, C5=71.11</w:t>
+              <w:t>C4=78.42, C5=73.64</w:t>
             </w:r>
           </w:p>
         </w:tc>
@@ -9278,7 +9283,7 @@
               <w:rPr>
                 <w:sz w:val="18"/>
               </w:rPr>
-              <w:t>차 3.60점. 최종 E={C4,C5}, α 0.552·0.448. 전체 R은 0.469·0.381.</w:t>
+              <w:t>차 4.78점. 최종 E={C4,C5}, α 0.569·0.431. 전체 R은 0.509·0.386.</w:t>
             </w:r>
           </w:p>
         </w:tc>
@@ -9299,7 +9304,7 @@
               <w:rPr>
                 <w:sz w:val="18"/>
               </w:rPr>
-              <w:t>C5=61.11, C4=47.06</w:t>
+              <w:t>C5=81.82, C4=52.63</w:t>
             </w:r>
           </w:p>
         </w:tc>
@@ -9315,7 +9320,7 @@
               <w:rPr>
                 <w:sz w:val="18"/>
               </w:rPr>
-              <w:t>차 14.05점이므로 C5 단일형. α(C5)=1.</w:t>
+              <w:t>차 29.19점이므로 C5 단일형. α(C5)=1.</w:t>
             </w:r>
           </w:p>
         </w:tc>
@@ -11083,7 +11088,7 @@
     </w:p>
     <w:p>
       <w:r>
-        <w:t>F는 간접 선호와 테마 범주 비중의 내적이다. r은 S4가 역사·자연·바다·음식·체험일 때 해당 범주 비중, 야경일 때 별도 night 비중이다. 콘텐츠·공연·쇼핑은 현재 직접 대응 열이 없어 r=0과 additional_metadata_required를 함께 반환한다.</w:t>
+        <w:t>F는 간접 선호와 테마 범주 비중의 내적이다. r은 S4의 두 관심사 중 자료가 있는 관심사 항의 평균이다. 역사·자연·바다·음식·체험은 해당 범주 비중, 야경은 별도 night 비중이다. 콘텐츠·공연·쇼핑은 직접 대응 열이 없어 평균에서 빼고 additional_metadata_required를 반환하며, 두 관심사 모두 자료가 없으면 r=0이다.</w:t>
       </w:r>
     </w:p>
     <w:tbl>
@@ -11846,7 +11851,7 @@
     </w:p>
     <w:p>
       <w:r>
-        <w:t>가상 응답은 30대·혼자·천천히·역사유적·한적한 곳·아침, B2의 문화유산 산책, F1의 비슷하게 중요함이다. 100점 환산 최종 점수는 C4 74.71, C5 71.11이고 α=0.552·0.448로 u=[0.321,0.434,0.028,0.128,0.090]이 된다.</w:t>
+        <w:t>가상 응답은 30대·혼자·천천히·역사유적과 자연숲길·한적한 곳·아침, B2의 문화유산 산책, B3의 없음, F1의 비슷하게 중요함이다. 100점 환산 최종 점수는 C4 78.42, C5 73.64이고 α=0.569·0.431로 u=[0.327,0.429,0.028,0.128,0.086]이 된다. 관심사 항 r은 역사 비중과 자연 비중의 평균이다.</w:t>
       </w:r>
     </w:p>
     <w:tbl>
@@ -12007,7 +12012,7 @@
               <w:rPr>
                 <w:sz w:val="18"/>
               </w:rPr>
-              <w:t>0.276972</w:t>
+              <w:t>0.278347</w:t>
             </w:r>
           </w:p>
         </w:tc>
@@ -12023,7 +12028,7 @@
               <w:rPr>
                 <w:sz w:val="18"/>
               </w:rPr>
-              <w:t>0.200000</w:t>
+              <w:t>0.177750</w:t>
             </w:r>
           </w:p>
         </w:tc>
@@ -12039,7 +12044,7 @@
               <w:rPr>
                 <w:sz w:val="18"/>
               </w:rPr>
-              <w:t>31.798165</w:t>
+              <w:t>30.406435</w:t>
             </w:r>
           </w:p>
         </w:tc>
@@ -12076,7 +12081,7 @@
               <w:rPr>
                 <w:sz w:val="18"/>
               </w:rPr>
-              <w:t>RESCENE Route</w:t>
+              <w:t>제주 K-Drama</w:t>
             </w:r>
           </w:p>
         </w:tc>
@@ -12092,7 +12097,7 @@
               <w:rPr>
                 <w:sz w:val="18"/>
               </w:rPr>
-              <w:t>0.221583</w:t>
+              <w:t>0.273350</w:t>
             </w:r>
           </w:p>
         </w:tc>
@@ -12108,7 +12113,7 @@
               <w:rPr>
                 <w:sz w:val="18"/>
               </w:rPr>
-              <w:t>0.164000</w:t>
+              <w:t>0.150500</w:t>
             </w:r>
           </w:p>
         </w:tc>
@@ -12124,7 +12129,7 @@
               <w:rPr>
                 <w:sz w:val="18"/>
               </w:rPr>
-              <w:t>25.705520</w:t>
+              <w:t>28.256644</w:t>
             </w:r>
           </w:p>
         </w:tc>
@@ -12177,7 +12182,7 @@
               <w:rPr>
                 <w:sz w:val="18"/>
               </w:rPr>
-              <w:t>0.232301</w:t>
+              <w:t>0.233495</w:t>
             </w:r>
           </w:p>
         </w:tc>
@@ -12193,7 +12198,7 @@
               <w:rPr>
                 <w:sz w:val="18"/>
               </w:rPr>
-              <w:t>0.146647</w:t>
+              <w:t>0.130380</w:t>
             </w:r>
           </w:p>
         </w:tc>
@@ -12209,7 +12214,7 @@
               <w:rPr>
                 <w:sz w:val="18"/>
               </w:rPr>
-              <w:t>25.263197</w:t>
+              <w:t>24.258385</w:t>
             </w:r>
           </w:p>
         </w:tc>
@@ -12246,7 +12251,7 @@
               <w:rPr>
                 <w:sz w:val="18"/>
               </w:rPr>
-              <w:t>제주 K-Drama</w:t>
+              <w:t>RESCENE Route</w:t>
             </w:r>
           </w:p>
         </w:tc>
@@ -12262,7 +12267,7 @@
               <w:rPr>
                 <w:sz w:val="18"/>
               </w:rPr>
-              <w:t>0.275224</w:t>
+              <w:t>0.222617</w:t>
             </w:r>
           </w:p>
         </w:tc>
@@ -12278,7 +12283,7 @@
               <w:rPr>
                 <w:sz w:val="18"/>
               </w:rPr>
-              <w:t>0.082500</w:t>
+              <w:t>0.123250</w:t>
             </w:r>
           </w:p>
         </w:tc>
@@ -12294,7 +12299,7 @@
               <w:rPr>
                 <w:sz w:val="18"/>
               </w:rPr>
-              <w:t>23.848271</w:t>
+              <w:t>23.057768</w:t>
             </w:r>
           </w:p>
         </w:tc>
@@ -12347,7 +12352,7 @@
               <w:rPr>
                 <w:sz w:val="18"/>
               </w:rPr>
-              <w:t>0.207331</w:t>
+              <w:t>0.206727</w:t>
             </w:r>
           </w:p>
         </w:tc>
@@ -12363,7 +12368,7 @@
               <w:rPr>
                 <w:sz w:val="18"/>
               </w:rPr>
-              <w:t>0.070500</w:t>
+              <w:t>0.096500</w:t>
             </w:r>
           </w:p>
         </w:tc>
@@ -12379,7 +12384,7 @@
               <w:rPr>
                 <w:sz w:val="18"/>
               </w:rPr>
-              <w:t>18.522067</w:t>
+              <w:t>20.215158</w:t>
             </w:r>
           </w:p>
         </w:tc>
@@ -12405,7 +12410,7 @@
           </m:fPr>
           <m:num>
             <m:r>
-              <m:t>0.276972</m:t>
+              <m:t>0.278347</m:t>
             </m:r>
             <m:r>
               <m:rPr>
@@ -12423,7 +12428,7 @@
               <m:t>×</m:t>
             </m:r>
             <m:r>
-              <m:t>0.400</m:t>
+              <m:t>0.3555</m:t>
             </m:r>
           </m:num>
           <m:den>
@@ -12439,23 +12444,23 @@
           <m:t>=</m:t>
         </m:r>
         <m:r>
-          <m:t>31.798165</m:t>
+          <m:t>30.406435</m:t>
         </m:r>
       </m:oMath>
     </w:p>
     <w:p>
       <w:r>
-        <w:t>영월 테마의 높은 값은 역사 비중 0.400에 S4의 역사 관심사가 더해졌기 때문이다. 제주 테마는 순수 범주 내적 F가 영월과 거의 같지만(0.275 대 0.277) 역사 비중이 작아 최종 순위가 낮아진다. 순위 이유를 F와 관심사 항으로 나누면 이 차이를 설명할 수 있다.</w:t>
+        <w:t>영월 테마는 역사 0.400·자연 0.311이어서 두 관심사 평균 0.3555가 다섯 테마 중 가장 크고, 범주 적합도 F도 가장 높아 1위다. 자연 관심사가 함께 들어가 자연 비중 0.437인 제주가 2위로 올라왔다(역사 하나만 고르던 6.4 예제에서는 4위). 순위 이유를 F와 관심사 항으로 나누면 이 차이를 설명할 수 있다.</w:t>
       </w:r>
     </w:p>
     <w:p>
       <w:r>
-        <w:t>상위 3개는 영월 왕과 사는 남자, 경주·거제 RESCENE Route, 서울 케이팝 데몬 헌터스다. 이는 제공된 테마 구성표에 의한 예제다. 작품명을 갖는 테마가 추천되었다고 해당 작품을 선호한다고 판단하지 않는다.</w:t>
+        <w:t>상위 3개는 영월 왕과 사는 남자, 제주 K-Drama, 서울 케이팝 데몬 헌터스다. 이는 제공된 테마 구성표에 의한 예제다. 작품명을 갖는 테마가 추천되었다고 해당 작품을 선호한다고 판단하지 않는다.</w:t>
       </w:r>
     </w:p>
     <w:p>
       <w:r>
-        <w:t>화면 설명 권장 항목: 최종 유형과 혼합 비중, 상위 범주, ThemeIndex와 항별 기여, primary interest 지원 상태, 데이터 버전. 31.80% 적중 확률처럼 퍼센트 확률로 표시하지 않는다.</w:t>
+        <w:t>화면 설명 권장 항목: 최종 유형과 혼합 비중, 상위 범주, ThemeIndex와 항별 기여, primary interest 지원 상태, 데이터 버전. 30.41% 적중 확률처럼 퍼센트 확률로 표시하지 않는다.</w:t>
       </w:r>
     </w:p>
     <w:p>
@@ -13174,7 +13179,7 @@
               <w:rPr>
                 <w:sz w:val="18"/>
               </w:rPr>
-              <w:t>S4가 역사·자연·체험·음식·바다</w:t>
+              <w:t>S4 두 관심사 중 역사·자연·체험·음식·바다·야경이 하나 이상</w:t>
             </w:r>
           </w:p>
         </w:tc>
@@ -13206,7 +13211,7 @@
               <w:rPr>
                 <w:sz w:val="18"/>
               </w:rPr>
-              <w:t>해당 범주 비중 p_ij</w:t>
+              <w:t>자료가 있는 관심사의 평균: 범주 비중 p_ij, 야경은 N_i</w:t>
             </w:r>
           </w:p>
         </w:tc>
@@ -13227,7 +13232,7 @@
               <w:rPr>
                 <w:sz w:val="18"/>
               </w:rPr>
-              <w:t>관심사(야경)</w:t>
+              <w:t>관심사(예)</w:t>
             </w:r>
           </w:p>
         </w:tc>
@@ -13243,7 +13248,7 @@
               <w:rPr>
                 <w:sz w:val="18"/>
               </w:rPr>
-              <w:t>S4가 야경</w:t>
+              <w:t>S4 역사+야경 / 역사+드라마</w:t>
             </w:r>
           </w:p>
         </w:tc>
@@ -13275,7 +13280,7 @@
               <w:rPr>
                 <w:sz w:val="18"/>
               </w:rPr>
-              <w:t>코스 야경 표식 N_i (0 또는 1)</w:t>
+              <w:t>(p_i,역사 + N_i) / 2 / p_i,역사(드라마는 자료 없음)</w:t>
             </w:r>
           </w:p>
         </w:tc>
@@ -13312,7 +13317,7 @@
               <w:rPr>
                 <w:sz w:val="18"/>
               </w:rPr>
-              <w:t>S6가 저녁·밤까지이고 S4가 야경이 아님</w:t>
+              <w:t>S6가 저녁·밤까지이고 S4에 야경이 없음</w:t>
             </w:r>
           </w:p>
         </w:tc>
@@ -13519,7 +13524,7 @@
               <w:rPr>
                 <w:sz w:val="18"/>
               </w:rPr>
-              <w:t>S4가 콘텐츠·공연·쇼핑, S3 적당히, S6 저녁·밤 외</w:t>
+              <w:t>S4 두 관심사가 모두 콘텐츠·공연·쇼핑, S3 적당히, S6 저녁·밤 외</w:t>
             </w:r>
           </w:p>
         </w:tc>
@@ -13564,7 +13569,7 @@
     </w:p>
     <w:p>
       <w:r>
-        <w:t>전수 경로 141,897개에서 효과를 확인했다. S4 관심사와 1위 코스의 가장 큰 범주가 같은 비율은 6.2 → 6.3 → 코스 재점검 후 순으로 역사 0.683→0.811→0.906, 자연 0.492→0.690→0.673, 체험 0.327→0.615→0.547, 음식 0.544→0.598→0.597, 바다 0.000→0.375→0.523이다. 설문 6.3에서 유형 점수를 100점 만점으로 환산한 뒤(완료 경로 109,552개)에는 역사 0.948, 자연 0.705, 체험 0.505, 음식 0.792, 바다 0.749다(12장). 경유지–관광지 연결 재점검(22장) 뒤 223코스에서는 역사 0.920, 자연 0.789, 체험 0.556, 음식 0.633, 바다 0.702다. 경유지를 나누고 관광지 범주로 분류하면서 음식·바다 비중이 뚜렷한 코스가 줄어(비중 0.3 이상 음식 23→21, 바다 26→20코스) 두 관심사의 일치율이 내렸다. 이때 빡빡하게·천천히의 상위 5개 평균 방문 후보 수는 5.63·4.16, 상위 5개 중 야경 코스 비중은 야경 관심사 0.892, 저녁·밤 응답 0.112다. 범주 미확인 경유지 재분류(22장) 뒤 234코스에서는 역사 0.911, 자연 0.735, 체험 0.545, 음식 0.805, 바다 0.678이다. 음식 경유지(장터·마켓·먹자골목 등)가 제대로 분류되어 음식 일치율이 0.633에서 0.805로 올랐다. 이때 빡빡하게·천천히의 상위 5개 평균 방문 후보 수는 5.92·3.99, 상위 5개 중 야경 코스 비중은 야경 관심사 1.000, 저녁·밤 응답 0.320이다. 2차 재분류(22장) 뒤에는 역사 0.910, 자연 0.693, 체험 0.552, 음식 0.805, 바다 0.693이고, 빡빡하게·천천히의 상위 5개 평균 방문 후보 수는 6.68·4.11, 상위 5개 중 야경 코스 비중은 야경 관심사 1.000, 저녁·밤 응답 0.323이다. 여행 속도 빡빡하게와 천천히의 상위 5개 평균 방문 후보 수는 6.2의 4.62·4.32에서 4.81·3.77로 벌어졌다. 상위 5개 중 야경 코스 비중은 야경 관심사에서 0.036→0.905, 저녁·밤 응답에서 0.033→0.124가 됐다. 모든 선택지가 같은 빈도라고 가정한 구조 점검이며 실제 이용자 분포가 아니다. 바다 비중 0.3 이상 코스는 코스 재점검으로 17개에서 26개가 됐다가 연결 재점검 뒤 20개, 범주 재분류 1·2차 뒤 21·22개로 여전히 적고, 바다 관심사의 일치율에는 공급 한계가 남는다.</w:t>
+        <w:t>전수 경로 141,897개에서 효과를 확인했다. S4 관심사와 1위 코스의 가장 큰 범주가 같은 비율은 6.2 → 6.3 → 코스 재점검 후 순으로 역사 0.683→0.811→0.906, 자연 0.492→0.690→0.673, 체험 0.327→0.615→0.547, 음식 0.544→0.598→0.597, 바다 0.000→0.375→0.523이다. 설문 6.3에서 유형 점수를 100점 만점으로 환산한 뒤(완료 경로 109,552개)에는 역사 0.948, 자연 0.705, 체험 0.505, 음식 0.792, 바다 0.749다(12장). 경유지–관광지 연결 재점검(22장) 뒤 223코스에서는 역사 0.920, 자연 0.789, 체험 0.556, 음식 0.633, 바다 0.702다. 경유지를 나누고 관광지 범주로 분류하면서 음식·바다 비중이 뚜렷한 코스가 줄어(비중 0.3 이상 음식 23→21, 바다 26→20코스) 두 관심사의 일치율이 내렸다. 이때 빡빡하게·천천히의 상위 5개 평균 방문 후보 수는 5.63·4.16, 상위 5개 중 야경 코스 비중은 야경 관심사 0.892, 저녁·밤 응답 0.112다. 범주 미확인 경유지 재분류(22장) 뒤 234코스에서는 역사 0.911, 자연 0.735, 체험 0.545, 음식 0.805, 바다 0.678이다. 음식 경유지(장터·마켓·먹자골목 등)가 제대로 분류되어 음식 일치율이 0.633에서 0.805로 올랐다. 이때 빡빡하게·천천히의 상위 5개 평균 방문 후보 수는 5.92·3.99, 상위 5개 중 야경 코스 비중은 야경 관심사 1.000, 저녁·밤 응답 0.320이다. 2차 재분류(22장) 뒤에는 역사 0.910, 자연 0.693, 체험 0.552, 음식 0.805, 바다 0.693이고, 빡빡하게·천천히의 상위 5개 평균 방문 후보 수는 6.68·4.11, 상위 5개 중 야경 코스 비중은 야경 관심사 1.000, 저녁·밤 응답 0.323이다. 여행 속도 빡빡하게와 천천히의 상위 5개 평균 방문 후보 수는 6.2의 4.62·4.32에서 4.81·3.77로 벌어졌다. 상위 5개 중 야경 코스 비중은 야경 관심사에서 0.036→0.905, 저녁·밤 응답에서 0.033→0.124가 됐다. 모든 선택지가 같은 빈도라고 가정한 구조 점검이며 실제 이용자 분포가 아니다. 바다 비중 0.3 이상 코스는 코스 재점검으로 17개에서 26개가 됐다가 연결 재점검 뒤 20개, 범주 재분류 1·2차 뒤 21·22개로 여전히 적고, 바다 관심사의 일치율에는 공급 한계가 남는다. 설문 6.4(S4 두 가지)의 완료 경로 1,756,396개에서 고른 관심사와 1위 코스의 가장 큰 범주가 같은 비율은 역사 0.717, 자연 0.515, 체험 0.343, 음식 0.596, 바다 0.357이고, 두 관심사 중 하나와 같은 비율은 0.659다. 1위 코스는 한 관심사에만 맞출 수 있어 한 가지 선택보다 낮다. 관심사별 1자리 보장이 없으면 두 관심사가 지역 대표 5개에 모두 들어가는 경우가 24.9%뿐이어서, 추천 6.5부터 지역 대표를 고를 때 관심사마다 한 자리를 먼저 채운다. 그 결과 모든 경로에서 두 관심사가 5개 안에 들어간다. 빡빡하게·천천히의 상위 5개 평균 방문 후보 수는 6.42·4.21, 상위 5개 중 야경 코스 비중은 야경 관심사 0.855, 저녁·밤 응답 0.322다.</w:t>
       </w:r>
     </w:p>
     <w:tbl>
@@ -13763,7 +13768,7 @@
               <w:rPr>
                 <w:sz w:val="18"/>
               </w:rPr>
-              <w:t>정렬을 순회해 원문 region이 처음 나온 코스만 선택, 최대 5개 지역. 실제 지리적 분산 최적화는 아님.</w:t>
+              <w:t>고른 관심사마다(자료가 있는 관심사만) 그 범주 비중이 가장 큰 코스(같은 최대 비중이면 모두 해당, 야경은 야경 코스) 중 최상위를 먼저 한 자리씩 넣고, 나머지는 정렬 순서대로 채운다. 같은 지역은 1개씩, 최대 5개 지역이며 표시는 정렬 순서. 실제 지리적 분산 최적화는 아님.</w:t>
             </w:r>
           </w:p>
         </w:tc>
@@ -13827,7 +13832,7 @@
     </w:p>
     <w:p>
       <w:r>
-        <w:t>예제 응답은 S4 역사, S3 천천히, S6 아침이다. 역사 관심사(w=0.5)와 천천히 여행 속도(w=0.1)가 적용되고 야경 항은 적용되지 않아 분모는 1.6이다. 범주 적합 점수는 100·fit이며, 최종 점수는 범주 기여를 1.6으로 나눈 값과 두 가산 점수의 합이다.</w:t>
+        <w:t>예제 응답은 S4 역사·자연, S3 천천히, S6 아침이다. 관심사(w=0.5, 역사 비중과 자연 비중의 평균)와 천천히 여행 속도(w=0.1)가 적용되고 야경 항은 적용되지 않아 분모는 1.6이다. 범주 적합 점수는 100·fit이며, 최종 점수는 범주 기여를 1.6으로 나눈 값과 두 가산 점수의 합이다.</w:t>
       </w:r>
     </w:p>
     <w:tbl>
@@ -14026,7 +14031,7 @@
               <w:rPr>
                 <w:sz w:val="18"/>
               </w:rPr>
-              <w:t>0.948879</w:t>
+              <w:t>0.951503</w:t>
             </w:r>
           </w:p>
         </w:tc>
@@ -14042,7 +14047,7 @@
               <w:rPr>
                 <w:sz w:val="18"/>
               </w:rPr>
-              <w:t>94.887929</w:t>
+              <w:t>95.150267</w:t>
             </w:r>
           </w:p>
         </w:tc>
@@ -14090,7 +14095,7 @@
               <w:rPr>
                 <w:sz w:val="18"/>
               </w:rPr>
-              <w:t>81.179956</w:t>
+              <w:t>81.343917</w:t>
             </w:r>
           </w:p>
         </w:tc>
@@ -14143,7 +14148,7 @@
               <w:rPr>
                 <w:sz w:val="18"/>
               </w:rPr>
-              <w:t>0.948879</w:t>
+              <w:t>0.951503</w:t>
             </w:r>
           </w:p>
         </w:tc>
@@ -14159,7 +14164,7 @@
               <w:rPr>
                 <w:sz w:val="18"/>
               </w:rPr>
-              <w:t>94.887929</w:t>
+              <w:t>95.150267</w:t>
             </w:r>
           </w:p>
         </w:tc>
@@ -14207,7 +14212,7 @@
               <w:rPr>
                 <w:sz w:val="18"/>
               </w:rPr>
-              <w:t>81.179956</w:t>
+              <w:t>81.343917</w:t>
             </w:r>
           </w:p>
         </w:tc>
@@ -14260,7 +14265,7 @@
               <w:rPr>
                 <w:sz w:val="18"/>
               </w:rPr>
-              <w:t>0.948879</w:t>
+              <w:t>0.951503</w:t>
             </w:r>
           </w:p>
         </w:tc>
@@ -14276,7 +14281,7 @@
               <w:rPr>
                 <w:sz w:val="18"/>
               </w:rPr>
-              <w:t>94.887929</w:t>
+              <w:t>95.150267</w:t>
             </w:r>
           </w:p>
         </w:tc>
@@ -14324,7 +14329,7 @@
               <w:rPr>
                 <w:sz w:val="18"/>
               </w:rPr>
-              <w:t>81.179956</w:t>
+              <w:t>81.343917</w:t>
             </w:r>
           </w:p>
         </w:tc>
@@ -14377,7 +14382,7 @@
               <w:rPr>
                 <w:sz w:val="18"/>
               </w:rPr>
-              <w:t>0.948879</w:t>
+              <w:t>0.951503</w:t>
             </w:r>
           </w:p>
         </w:tc>
@@ -14393,7 +14398,7 @@
               <w:rPr>
                 <w:sz w:val="18"/>
               </w:rPr>
-              <w:t>94.887929</w:t>
+              <w:t>95.150267</w:t>
             </w:r>
           </w:p>
         </w:tc>
@@ -14441,7 +14446,7 @@
               <w:rPr>
                 <w:sz w:val="18"/>
               </w:rPr>
-              <w:t>81.179956</w:t>
+              <w:t>81.343917</w:t>
             </w:r>
           </w:p>
         </w:tc>
@@ -14478,7 +14483,7 @@
               <w:rPr>
                 <w:sz w:val="18"/>
               </w:rPr>
-              <w:t>천안 / 목요일</w:t>
+              <w:t>파주 / 2026 파주시티투어 당일코스(목요일)</w:t>
             </w:r>
           </w:p>
         </w:tc>
@@ -14494,7 +14499,7 @@
               <w:rPr>
                 <w:sz w:val="18"/>
               </w:rPr>
-              <w:t>0.854971</w:t>
+              <w:t>0.943201</w:t>
             </w:r>
           </w:p>
         </w:tc>
@@ -14510,7 +14515,7 @@
               <w:rPr>
                 <w:sz w:val="18"/>
               </w:rPr>
-              <w:t>85.497131</w:t>
+              <w:t>94.320088</w:t>
             </w:r>
           </w:p>
         </w:tc>
@@ -14526,7 +14531,7 @@
               <w:rPr>
                 <w:sz w:val="18"/>
               </w:rPr>
-              <w:t>20.833333</w:t>
+              <w:t>15.625000</w:t>
             </w:r>
           </w:p>
         </w:tc>
@@ -14558,7 +14563,7 @@
               <w:rPr>
                 <w:sz w:val="18"/>
               </w:rPr>
-              <w:t>80.519040</w:t>
+              <w:t>80.825055</w:t>
             </w:r>
           </w:p>
         </w:tc>
@@ -14621,22 +14626,22 @@
         <w:pStyle w:val="Heading2"/>
       </w:pPr>
       <w:r>
-        <w:t>천안 · 목요일</w:t>
+        <w:t>파주 · 2026 파주시티투어 당일코스(목요일)</w:t>
       </w:r>
     </w:p>
     <w:p>
       <w:r>
-        <w:t>태학산 치유의 숲 → 점심(아우내장터) → 유관순열사사적지 → 독립기념관</w:t>
+        <w:t>황희선생유적지 → 황포돛배 → 산머루농원</w:t>
       </w:r>
     </w:p>
     <w:p>
       <w:r>
-        <w:t>해남 시티투어는 원문이 "일요일코스(산이정원 → 대흥사)"여서 코스 재점검 전에는 경로를 읽지 못해 제외됐던 코스다. 범주 비중은 [0.5,0.5,0,0,0], 방문 후보는 2곳(L=0)이다. 범주 기여 역사 25.184316·자연 34.120640에 관심사 100×0.5×0.5/1.6=15.625000과 속도 100×0.1×1/1.6=6.250000을 더해 81.179956이 된다. 대전 생태교육·아산 역사기행 코스·순천 나이트가든투어도 역사·자연 반반, 방문 후보 2~3곳(L=0)이어서 해남과 점수가 같고 course_id가 표시 순서만 정한다. 천안 목요일은 역사 2/3·자연 1/3, 방문 후보 3곳이다. 대전 생태교육은 2차 재분류에서 "대청호(대청댐물문화관)"의 괄호 속 설명이 자연으로 분류되면서 올라왔다. 같은 점수의 대전 역사문화(동춘당)는 대전이 이미 2위에 있어 대표 5개에서 빠지고 전체 순위표에 남는다. 아산·순천 코스는 1차 재분류로 현충사은행나무길·철도관사마을이 역사로 잡히면서 올라왔다. 범주 적합 점수만 보면 가장 높은 코스는 부산 오렌지라인(98.720420)이고, 6.2에서 1위였던 연천명소코스(95.558543)는 역사 비중이 0.25여서 43위(72.536589)다.</w:t>
+        <w:t>해남 시티투어는 원문이 "일요일코스(산이정원 → 대흥사)"여서 코스 재점검 전에는 경로를 읽지 못해 제외됐던 코스다. 범주 비중은 [0.5,0.5,0,0,0], 방문 후보는 2곳(L=0)이고 관심사 항은 역사 0.5와 자연 0.5의 평균 0.5다. 범주 기여 역사 25.729613·자연 33.739304에 관심사 100×0.5×0.5/1.6=15.625000과 속도 100×0.1×1/1.6=6.250000을 더해 81.343917이 된다. 해남은 역사 자리, 대전 생태교육은 자연 자리로 먼저 들어갔고(둘 다 역사·자연 반반이라 두 관심사 모두에 해당), 아산 역사기행 코스·순천 나이트가든투어·파주 당일코스는 점수 순서로 채웠다. 네 코스는 점수가 같아 course_id가 표시 순서만 정한다. 파주 당일코스는 역사 1/3·자연 2/3, 방문 후보 3곳이다. 범주 적합 점수만 보면 가장 높은 코스는 부산 오렌지라인(98.573926)이고, 6.2에서 1위였던 연천명소코스는 20위(76.358759)다.</w:t>
       </w:r>
     </w:p>
     <w:p>
       <w:r>
-        <w:t>위 코스·경유지는 입력 원문을 보존한 결과이며 실시간 운행 확인이 아니다. 대표 6위인 평창 북부권 코스의 요일별 출발역(서울역(금요일)·청량리역(토요일))처럼 기존 적격 플래그가 포착하지 못한 조건 표현도 남아 있다. 분석 적격 판정과 실제 경유지·운행 검증을 분리하고 운영기관 검토 대상으로 표시한다.</w:t>
+        <w:t>위 코스·경유지는 입력 원문을 보존한 결과이며 실시간 운행 확인이 아니다. 평창 북부권 코스의 요일별 출발역(서울역(금요일)·청량리역(토요일))처럼 기존 적격 플래그가 포착하지 못한 조건 표현도 남아 있다. 분석 적격 판정과 실제 경유지·운행 검증을 분리하고 운영기관 검토 대상으로 표시한다.</w:t>
       </w:r>
     </w:p>
     <w:p>
@@ -20474,7 +20479,7 @@
                 <w:b/>
                 <w:sz w:val="18"/>
               </w:rPr>
-              <w:t>신규 6.4 기본 경로</w:t>
+              <w:t>신규 6.5 기본 경로</w:t>
             </w:r>
           </w:p>
         </w:tc>
@@ -22268,7 +22273,7 @@
     </w:p>
     <w:p>
       <w:r>
-        <w:t>이 식은 기존 0~1 척도의 보정 정의다. 6.4 ThemeIndex·CourseScore에 활성화하려면 입력 자격·장소 연결·척도 변환·상한·효과 검증을 먼저 정해야 한다. 이번 참조 구현은 비활성 이유와 가산 0을 명시한다.</w:t>
+        <w:t>이 식은 기존 0~1 척도의 보정 정의다. 6.5 ThemeIndex·CourseScore에 활성화하려면 입력 자격·장소 연결·척도 변환·상한·효과 검증을 먼저 정해야 한다. 이번 참조 구현은 비활성 이유와 가산 0을 명시한다.</w:t>
       </w:r>
     </w:p>
     <w:p>
@@ -22282,7 +22287,7 @@
     </w:p>
     <w:p>
       <w:r>
-        <w:t>현재 분기형 설문에는 H1~H4가 없다. 아래는 기존 확장 모듈의 조건부 활용 정의이며, 6.4 기본 추천에는 H=0으로 남긴다. C7 선택이나 S4의 드라마·K팝 선택을 콘텐츠별 직접 평점으로 대체하지 않는다.</w:t>
+        <w:t>현재 분기형 설문에는 H1~H4가 없다. 아래는 기존 확장 모듈의 조건부 활용 정의이며, 6.5 기본 추천에는 H=0으로 남긴다. C7 선택이나 S4의 드라마·K팝 선택을 콘텐츠별 직접 평점으로 대체하지 않는다.</w:t>
       </w:r>
     </w:p>
     <w:p>
@@ -26299,7 +26304,7 @@
               <w:rPr>
                 <w:sz w:val="18"/>
               </w:rPr>
-              <w:t>C2 +2 (13.33) · C5 +1 (5.56)</w:t>
+              <w:t>C2 +2 (10.53) · C5 +1 (4.55)</w:t>
             </w:r>
           </w:p>
         </w:tc>
@@ -26352,7 +26357,7 @@
               <w:rPr>
                 <w:sz w:val="18"/>
               </w:rPr>
-              <w:t>C1 +1 (5.56) · C5 +3 (16.67) · C7 +1 (7.14) · C8 +1 (9.09)</w:t>
+              <w:t>C1 +1 (4.35) · C5 +3 (13.64) · C7 +1 (5.88) · C8 +1 (9.09)</w:t>
             </w:r>
           </w:p>
         </w:tc>
@@ -26405,7 +26410,7 @@
               <w:rPr>
                 <w:sz w:val="18"/>
               </w:rPr>
-              <w:t>C4 +2 (11.76) · C5 +3 (16.67)</w:t>
+              <w:t>C4 +2 (10.53) · C5 +3 (13.64)</w:t>
             </w:r>
           </w:p>
         </w:tc>
@@ -26442,7 +26447,7 @@
               <w:rPr>
                 <w:sz w:val="18"/>
               </w:rPr>
-              <w:t>C</w:t>
+              <w:t>C, D</w:t>
             </w:r>
           </w:p>
         </w:tc>
@@ -26458,7 +26463,7 @@
               <w:rPr>
                 <w:sz w:val="18"/>
               </w:rPr>
-              <w:t>C3 +1 (6.25) · C4 +3 (17.65) · C10 +3 (33.33)</w:t>
+              <w:t>C3 +1 (5.00) · C4 +5 (26.32) · C5 +3 (13.64) · C9 +2 (18.18) · C10 +4 (26.67)</w:t>
             </w:r>
           </w:p>
         </w:tc>
@@ -26511,7 +26516,7 @@
               <w:rPr>
                 <w:sz w:val="18"/>
               </w:rPr>
-              <w:t>C4 +1 (5.88) · C5 +3 (16.67) · C6 +1 (10.00)</w:t>
+              <w:t>C4 +1 (5.26) · C5 +3 (13.64) · C6 +1 (10.00)</w:t>
             </w:r>
           </w:p>
         </w:tc>
@@ -26564,7 +26569,7 @@
               <w:rPr>
                 <w:sz w:val="18"/>
               </w:rPr>
-              <w:t>C4 +2 (11.76) · C5 +1 (5.56)</w:t>
+              <w:t>C4 +2 (10.53) · C5 +1 (4.55)</w:t>
             </w:r>
           </w:p>
         </w:tc>
@@ -26617,7 +26622,60 @@
               <w:rPr>
                 <w:sz w:val="18"/>
               </w:rPr>
-              <w:t>C4 +3 (17.65) · C10 +1 (11.11)</w:t>
+              <w:t>C4 +3 (15.79) · C10 +1 (6.67)</w:t>
+            </w:r>
+          </w:p>
+        </w:tc>
+      </w:tr>
+      <w:tr>
+        <w:trPr>
+          <w:cantSplit/>
+        </w:trPr>
+        <w:tc>
+          <w:tcPr>
+            <w:tcW w:type="dxa" w:w="1095"/>
+          </w:tcPr>
+          <w:p>
+            <w:pPr>
+              <w:spacing w:after="60" w:before="60" w:line="252" w:lineRule="auto"/>
+            </w:pPr>
+            <w:r>
+              <w:rPr>
+                <w:sz w:val="18"/>
+              </w:rPr>
+              <w:t>B3</w:t>
+            </w:r>
+          </w:p>
+        </w:tc>
+        <w:tc>
+          <w:tcPr>
+            <w:tcW w:type="dxa" w:w="1216"/>
+          </w:tcPr>
+          <w:p>
+            <w:pPr>
+              <w:spacing w:after="60" w:before="60" w:line="252" w:lineRule="auto"/>
+            </w:pPr>
+            <w:r>
+              <w:rPr>
+                <w:sz w:val="18"/>
+              </w:rPr>
+              <w:t>D</w:t>
+            </w:r>
+          </w:p>
+        </w:tc>
+        <w:tc>
+          <w:tcPr>
+            <w:tcW w:type="dxa" w:w="7662"/>
+          </w:tcPr>
+          <w:p>
+            <w:pPr>
+              <w:spacing w:after="60" w:before="60" w:line="252" w:lineRule="auto"/>
+            </w:pPr>
+            <w:r>
+              <w:rPr>
+                <w:sz w:val="18"/>
+              </w:rPr>
+              <w:t>없음. 모든 유형 +0</w:t>
             </w:r>
           </w:p>
         </w:tc>
@@ -26799,7 +26857,7 @@
               <w:rPr>
                 <w:sz w:val="18"/>
               </w:rPr>
-              <w:t>47.06</w:t>
+              <w:t>52.63</w:t>
             </w:r>
           </w:p>
         </w:tc>
@@ -26815,7 +26873,7 @@
               <w:rPr>
                 <w:sz w:val="18"/>
               </w:rPr>
-              <w:t>61.11</w:t>
+              <w:t>63.64</w:t>
             </w:r>
           </w:p>
         </w:tc>
@@ -26831,7 +26889,7 @@
               <w:rPr>
                 <w:sz w:val="18"/>
               </w:rPr>
-              <w:t>원점수 8/17과 11/18의 100점 환산</w:t>
+              <w:t>원점수 10/19와 14/22의 100점 환산</w:t>
             </w:r>
           </w:p>
         </w:tc>
@@ -26868,7 +26926,7 @@
               <w:rPr>
                 <w:sz w:val="18"/>
               </w:rPr>
-              <w:t>64.71</w:t>
+              <w:t>68.42</w:t>
             </w:r>
           </w:p>
         </w:tc>
@@ -26884,7 +26942,7 @@
               <w:rPr>
                 <w:sz w:val="18"/>
               </w:rPr>
-              <w:t>61.11</w:t>
+              <w:t>63.64</w:t>
             </w:r>
           </w:p>
         </w:tc>
@@ -26900,7 +26958,7 @@
               <w:rPr>
                 <w:sz w:val="18"/>
               </w:rPr>
-              <w:t>최고점 차 3.60 ≤ 12 → F1 필요</w:t>
+              <w:t>B3가 남아 아직 판정하지 않음</w:t>
             </w:r>
           </w:p>
         </w:tc>
@@ -26921,7 +26979,7 @@
               <w:rPr>
                 <w:sz w:val="18"/>
               </w:rPr>
-              <w:t>F1 BALANCED</w:t>
+              <w:t>B3 D 추가</w:t>
             </w:r>
           </w:p>
         </w:tc>
@@ -26937,7 +26995,7 @@
               <w:rPr>
                 <w:sz w:val="18"/>
               </w:rPr>
-              <w:t>74.71</w:t>
+              <w:t>68.42</w:t>
             </w:r>
           </w:p>
         </w:tc>
@@ -26953,7 +27011,7 @@
               <w:rPr>
                 <w:sz w:val="18"/>
               </w:rPr>
-              <w:t>71.11</w:t>
+              <w:t>63.64</w:t>
             </w:r>
           </w:p>
         </w:tc>
@@ -26969,7 +27027,7 @@
               <w:rPr>
                 <w:sz w:val="18"/>
               </w:rPr>
-              <w:t>C4·C5 혼합 → u 생성</w:t>
+              <w:t>없음은 점수 유지. 최고점 차 4.78 ≤ 12 → F1 필요</w:t>
             </w:r>
           </w:p>
         </w:tc>
@@ -26990,7 +27048,7 @@
               <w:rPr>
                 <w:sz w:val="18"/>
               </w:rPr>
-              <w:t>같은 공통 응답에서 B2 D 선택</w:t>
+              <w:t>F1 BALANCED</w:t>
             </w:r>
           </w:p>
         </w:tc>
@@ -27006,7 +27064,7 @@
               <w:rPr>
                 <w:sz w:val="18"/>
               </w:rPr>
-              <w:t>47.06</w:t>
+              <w:t>78.42</w:t>
             </w:r>
           </w:p>
         </w:tc>
@@ -27022,7 +27080,7 @@
               <w:rPr>
                 <w:sz w:val="18"/>
               </w:rPr>
-              <w:t>61.11</w:t>
+              <w:t>73.64</w:t>
             </w:r>
           </w:p>
         </w:tc>
@@ -27038,7 +27096,76 @@
               <w:rPr>
                 <w:sz w:val="18"/>
               </w:rPr>
-              <w:t>기존 점수 유지. 차 14.05 → F1 없음, C5 단일형</w:t>
+              <w:t>C4·C5 혼합 → u 생성</w:t>
+            </w:r>
+          </w:p>
+        </w:tc>
+      </w:tr>
+      <w:tr>
+        <w:trPr>
+          <w:cantSplit/>
+        </w:trPr>
+        <w:tc>
+          <w:tcPr>
+            <w:tcW w:type="dxa" w:w="5351"/>
+          </w:tcPr>
+          <w:p>
+            <w:pPr>
+              <w:spacing w:after="60" w:before="60" w:line="252" w:lineRule="auto"/>
+            </w:pPr>
+            <w:r>
+              <w:rPr>
+                <w:sz w:val="18"/>
+              </w:rPr>
+              <w:t>같은 공통 응답에서 B2 D · B3 A</w:t>
+            </w:r>
+          </w:p>
+        </w:tc>
+        <w:tc>
+          <w:tcPr>
+            <w:tcW w:type="dxa" w:w="973"/>
+          </w:tcPr>
+          <w:p>
+            <w:pPr>
+              <w:spacing w:after="60" w:before="60" w:line="252" w:lineRule="auto"/>
+            </w:pPr>
+            <w:r>
+              <w:rPr>
+                <w:sz w:val="18"/>
+              </w:rPr>
+              <w:t>52.63</w:t>
+            </w:r>
+          </w:p>
+        </w:tc>
+        <w:tc>
+          <w:tcPr>
+            <w:tcW w:type="dxa" w:w="973"/>
+          </w:tcPr>
+          <w:p>
+            <w:pPr>
+              <w:spacing w:after="60" w:before="60" w:line="252" w:lineRule="auto"/>
+            </w:pPr>
+            <w:r>
+              <w:rPr>
+                <w:sz w:val="18"/>
+              </w:rPr>
+              <w:t>81.82</w:t>
+            </w:r>
+          </w:p>
+        </w:tc>
+        <w:tc>
+          <w:tcPr>
+            <w:tcW w:type="dxa" w:w="2675"/>
+          </w:tcPr>
+          <w:p>
+            <w:pPr>
+              <w:spacing w:after="60" w:before="60" w:line="252" w:lineRule="auto"/>
+            </w:pPr>
+            <w:r>
+              <w:rPr>
+                <w:sz w:val="18"/>
+              </w:rPr>
+              <w:t>B2 없음은 C4 점수 유지, B3 A가 C5 +4. 차 29.19 → F1 없음, C5 단일형</w:t>
             </w:r>
           </w:p>
         </w:tc>
@@ -27046,12 +27173,12 @@
     </w:tbl>
     <w:p>
       <w:r>
-        <w:t>혼합 응답의 F1 전 원점수는 C1 1, C2 2, C3 1, C4 11, C5 11, C6 1, C7 1, C8 1, C9 0, C10 4다. F1까지 반영한 100점 환산 점수는 C1 5.56, C2 13.33, C3 6.25, C4 74.71, C5 71.11, C6 10.00, C7 7.14, C8 9.09, C9 0.00, C10 44.44다. 유형마다 만점을 100으로 맞출 뿐 열 유형의 합을 100으로 맞추지 않는다. 원점수가 같은 C4와 C5도 만점이 17점과 18점이어서 환산 점수가 다르다. D 비교는 C10도 원점수 3점(33.33점)을 유지하며 B2 A의 +1을 받지 않는다.</w:t>
+        <w:t>혼합 응답의 F1 전 원점수는 C1 1, C2 2, C3 1, C4 13, C5 14, C6 1, C7 1, C8 1, C9 2, C10 5다. F1까지 반영한 100점 환산 점수는 C1 4.35, C2 10.53, C3 5.00, C4 78.42, C5 73.64, C6 10.00, C7 5.88, C8 9.09, C9 18.18, C10 33.33이다. 유형마다 만점을 100으로 맞출 뿐 열 유형의 합을 100으로 맞추지 않는다. C4와 C5는 만점이 19점과 22점이어서 원점수 13·14가 68.42·63.64로 순서가 바뀐다. D 비교에서 B2 없음을 고르면 C4는 B2 A의 +3을 받지 않고 원점수 10점(52.63)에 머문다.</w:t>
       </w:r>
     </w:p>
     <w:p>
       <w:r>
-        <w:t>혼합 예제는 테마 영월 31.798165점, 대표 시티투어 해남 해남시티투어 81.179956점으로 이어진다. 같은 공통 응답에서 B2 D를 고른 C5 단일형은 역사 관심사 가산을 똑같이 받지만 자연 중심 선호여서 파주 2026 파주시티투어 당일코스(목요일)가 72.734493점으로 1위다. 숫자의 크기만으로 어느 쪽 추천이 더 좋다고 비교하지 않는다. 상세 JSON에는 원장·상대 가중치·혼합 α·u·테마 전부·234개 코스·대표 5개가 함께 들어 있다.</w:t>
+        <w:t>혼합 예제는 테마 영월 30.406435점, 대표 시티투어 해남 해남시티투어 81.343917점으로 이어진다. B2 없음·B3 A를 고른 C5 단일형은 같은 관심사 가산을 받지만 자연 중심 선호여서 대전 힐링(만인산)이 79.738756점으로 1위이고, 역사 자리에는 해남 해남시티투어(69.610163점)가 들어간다. 숫자의 크기만으로 어느 쪽 추천이 더 좋다고 비교하지 않는다. 상세 JSON에는 원장·상대 가중치·혼합 α·u·테마 전부·234개 코스·대표 5개가 함께 들어 있다.</w:t>
       </w:r>
     </w:p>
     <w:p>
@@ -27130,7 +27257,7 @@
                 <w:b/>
                 <w:sz w:val="18"/>
               </w:rPr>
-              <w:t>신규 6.3 / 참조 6.4</w:t>
+              <w:t>신규 6.4 / 참조 6.5</w:t>
             </w:r>
           </w:p>
         </w:tc>
@@ -27289,7 +27416,7 @@
               <w:rPr>
                 <w:sz w:val="18"/>
               </w:rPr>
-              <w:t>S1~S6 모두 단일, B 1개, 조건부 F1</w:t>
+              <w:t>S1~S6(S4만 두 가지), B 1~2개, 조건부 F1</w:t>
             </w:r>
           </w:p>
         </w:tc>
@@ -27342,7 +27469,7 @@
               <w:rPr>
                 <w:sz w:val="18"/>
               </w:rPr>
-              <w:t>S4 가장 중요한 1개와 해당 분기. 테마와 코스 점수에 모두 가산</w:t>
+              <w:t>S4 정확히 2개(같은 비중)와 각 분기. 테마와 코스 점수에 두 관심사의 평균으로 가산, 지역 대표 5개에 관심사별 1자리</w:t>
             </w:r>
           </w:p>
         </w:tc>
@@ -27871,7 +27998,7 @@
               <w:rPr>
                 <w:sz w:val="18"/>
               </w:rPr>
-              <w:t>문항·선택값·C 점수표와 분기 규칙. 버전 branch-survey-6.3-proposal. 유형별 최대 원점수 type_max_raw와 경계값 포함</w:t>
+              <w:t>문항·선택값·C 점수표와 분기 규칙. 버전 branch-survey-6.4-proposal. S4는 select_count 2. 유형별 최대 원점수 type_max_raw와 경계값 포함</w:t>
             </w:r>
           </w:p>
         </w:tc>
@@ -27945,7 +28072,7 @@
               <w:rPr>
                 <w:sz w:val="18"/>
               </w:rPr>
-              <w:t>완료 응답 → α·u·테마 순위·적용 가산 항·234코스 순위와 가산 점수·대표 지역5</w:t>
+              <w:t>완료 응답 → α·u·테마 순위·적용 가산 항·234코스 순위와 가산 점수·대표 지역5(관심사별 1자리)</w:t>
             </w:r>
           </w:p>
         </w:tc>
@@ -28093,7 +28220,7 @@
               <w:rPr>
                 <w:sz w:val="18"/>
               </w:rPr>
-              <w:t>설문 6.3 전수 검증 결과</w:t>
+              <w:t>설문 6.4 전수 검증 결과</w:t>
             </w:r>
           </w:p>
         </w:tc>
@@ -28130,7 +28257,7 @@
               <w:rPr>
                 <w:sz w:val="18"/>
               </w:rPr>
-              <w:t>6.4 연결 예제의 산식·범위·기여와 가산 합·가산 적용 조건 검사 결과</w:t>
+              <w:t>6.5 연결 예제의 산식·범위·기여와 가산 합·가산 적용 조건 검사 결과</w:t>
             </w:r>
           </w:p>
         </w:tc>
@@ -28630,7 +28757,7 @@
               <w:rPr>
                 <w:sz w:val="18"/>
               </w:rPr>
-              <w:t>고정 선택지 60개, 공통+분기 47,628경로, F1 포함 완료 109,552경로. 7/8응답 종료, 전 유형 단일 결과 도달, 유형마다 최고 경로에서 정확히 100점, D 무변경 확인.</w:t>
+              <w:t>고정 선택지 60개, S4 두 가지 조합 36개, 공통+분기 730,296경로, F1 포함 완료 1,756,396경로. 7~9응답 종료, 전 유형 단일 결과 도달, 유형마다 최고 경로에서 정확히 100점, D 무변경, 같은 분기 한 번만 확인.</w:t>
             </w:r>
           </w:p>
         </w:tc>
@@ -28667,7 +28794,7 @@
               <w:rPr>
                 <w:sz w:val="18"/>
               </w:rPr>
-              <w:t>C4·C5 혼합, D 비교, u 합 1, W 정규화, 테마 0~100, 234코스 점수·기여와 가산 합, 지역 5개 중복 제거, 가산 항이 없으면 6.2 식과 같음, 야경 관심사 상위 3개가 야경 코스, 바다 관심사 C9 도달 확인.</w:t>
+              <w:t>C4·C5 혼합, D 비교, u 합 1, W 정규화, 테마 0~100, 234코스 점수·기여와 가산 합, 지역 5개 중복 제거, 가산 항이 없으면 6.2 식과 같음, 야경 관심사 상위 3개가 야경 코스, 바다 관심사 C9 도달, 두 관심사가 지역 대표 5개에 모두 포함 확인.</w:t>
             </w:r>
           </w:p>
         </w:tc>
@@ -28741,7 +28868,7 @@
               <w:rPr>
                 <w:sz w:val="18"/>
               </w:rPr>
-              <w:t>v2 39개, v3 22개, v4 30개 검사. 해당 확장 산식 검사이며 6.4 기본값에서 모두 활성이라는 뜻은 아님.</w:t>
+              <w:t>v2 39개, v3 22개, v4 30개 검사. 해당 확장 산식 검사이며 6.5 기본값에서 모두 활성이라는 뜻은 아님.</w:t>
             </w:r>
           </w:p>
         </w:tc>
@@ -28886,7 +29013,7 @@
       <w:pStyle w:val="Caption"/>
     </w:pPr>
     <w:r>
-      <w:t>TOUR NAVIGATOR   /   INTEGRATED 6.4</w:t>
+      <w:t>TOUR NAVIGATOR   /   INTEGRATED 6.5</w:t>
     </w:r>
   </w:p>
 </w:hdr>

</xml_diff>

<commit_message>
Fix stale 6.3-era sentences found in review
- Spec (MD/JSON/Word): S4 two-pick wording in ch.4/20/35/36, demo mix
  0.569/0.431 and u, max mixed types 10, 7~9 answers, 6.3 label on the
  margin rationale
- reference_calc/README: integrated 6.5, two-interest input, interest
  mean, night rule, reserved regional slots
- Release notes and manifest

Co-Authored-By: Claude Opus 5.5 <noreply@anthropic.com>
Claude-Session: https://claude.ai/code/session_01U2znPGm3mBPJ99vgtQRoQ3
</commit_message>
<xml_diff>
--- a/docs/Tour_Navigator_Cosine_Specification.docx
+++ b/docs/Tour_Navigator_Cosine_Specification.docx
@@ -3530,7 +3530,7 @@
     </w:tbl>
     <w:p>
       <w:r>
-        <w:t>표에 없는 유형의 가산은 0이다. S1~S6은 모두 단일 선택이며 빠진 필수 문항이 있으면 점수를 확정하지 않고 다음 질문을 반환한다. S3는 유형 점수 외에 체류 속도 배율에도 연결된다.</w:t>
+        <w:t>표에 없는 유형의 가산은 0이다. S4를 제외한 S1~S6은 단일 선택이고 S4는 서로 다른 두 가지를 고르며, 빠진 필수 문항이 있으면 점수를 확정하지 않고 다음 질문을 반환한다. S3는 유형 점수 외에 체류 속도 배율에도 연결된다.</w:t>
       </w:r>
     </w:p>
     <w:p>
@@ -9185,7 +9185,7 @@
     </w:p>
     <w:p>
       <w:r>
-        <w:t>경계는 원점수 2점이 평균 최대 원점수 13.7점의 약 15%라는 점을 기준으로 10·12·15점을, F1 가산은 20·25·30점을 전수 경로에서 비교해 정했다. 12점과 20점 조합이 유형 쏠림이 가장 작고 관심사 일치율도 높았다. F1 20점은 12점 차 안의 후보 중 선택한 유형이 1위가 되고, 나머지 후보와 8점 이상 벌어지게 하는 크기다.</w:t>
+        <w:t>경계는 6.3 기준으로 원점수 2점이 평균 최대 원점수 13.7점의 약 15%라는 점(6.4의 평균 최대 원점수 16.7점에서는 약 12%)을 기준으로 10·12·15점을, F1 가산은 20·25·30점을 전수 경로에서 비교해 정했다. 12점과 20점 조합이 유형 쏠림이 가장 작고 관심사 일치율도 높았다. F1 20점은 12점 차 안의 후보 중 선택한 유형이 1위가 되고, 나머지 후보와 8점 이상 벌어지게 하는 크기다.</w:t>
       </w:r>
     </w:p>
     <w:p>
@@ -9402,7 +9402,7 @@
     </w:tbl>
     <w:p>
       <w:r>
-        <w:t>6.3 전수 검증에서도 최종 복합 후보가 최대 9개인 경로가 존재한다. 복합 결과는 구분 근거가 약하다는 뜻도 함께 갖는다. 서비스에서 단일 유형만 강제하려면 현재와 다른 추가 정책 및 검증이 필요하다.</w:t>
+        <w:t>6.4 전수 검증에서도 최종 복합 후보가 최대 10개인 경로가 존재한다. 복합 결과는 구분 근거가 약하다는 뜻도 함께 갖는다. 서비스에서 단일 유형만 강제하려면 현재와 다른 추가 정책 및 검증이 필요하다.</w:t>
       </w:r>
     </w:p>
     <w:p>
@@ -10814,7 +10814,7 @@
     </w:p>
     <w:p>
       <w:r>
-        <w:t>예제의 C4·C5 혼합 비중이 0.552·0.448이면 u=[0.321, 0.434, 0.028, 0.128, 0.090]이다. 이 벡터를 PCA 점수나 콘텐츠 방한 의향 확률로 해석하지 않는다.</w:t>
+        <w:t>예제의 C4·C5 혼합 비중이 0.569·0.431이면 u=[0.327, 0.429, 0.028, 0.128, 0.086]이다. 이 벡터를 PCA 점수나 콘텐츠 방한 의향 확률로 해석하지 않는다.</w:t>
       </w:r>
     </w:p>
     <w:p>
@@ -12450,7 +12450,7 @@
     </w:p>
     <w:p>
       <w:r>
-        <w:t>영월 테마는 역사 0.400·자연 0.311이어서 두 관심사 평균 0.3555가 다섯 테마 중 가장 크고, 범주 적합도 F도 가장 높아 1위다. 자연 관심사가 함께 들어가 자연 비중 0.437인 제주가 2위로 올라왔다(역사 하나만 고르던 6.4 예제에서는 4위). 순위 이유를 F와 관심사 항으로 나누면 이 차이를 설명할 수 있다.</w:t>
+        <w:t>영월 테마는 역사 0.400·자연 0.311이어서 두 관심사 평균 0.3555가 다섯 테마 중 가장 크고, 범주 적합도 F도 가장 높아 1위다. 자연 관심사가 함께 들어가 자연 비중 0.437인 제주가 2위로 올라왔다(S4에서 역사 하나만 고르던 추천 6.4·설문 6.3 예제에서는 4위). 순위 이유를 F와 관심사 항으로 나누면 이 차이를 설명할 수 있다.</w:t>
       </w:r>
     </w:p>
     <w:p>
@@ -15673,7 +15673,7 @@
     </w:p>
     <w:p>
       <w:r>
-        <w:t>신규 분기형 응답은 S1~S6, 활성 B 하나, 필요한 F1의 문자 선택값으로 저장한다. 0~5 직접 선호 CSV가 없는 경우 신규 u를 생성할 수 있지만, 이를 직접 측정 응답 CSV로 다시 표기하거나 덮어쓰지 않는다.</w:t>
+        <w:t>신규 분기형 응답은 S1~S6(S4는 서로 다른 두 값의 목록), 활성 B 1~2개, 필요한 F1의 문자 선택값으로 저장한다. 0~5 직접 선호 CSV가 없는 경우 신규 u를 생성할 수 있지만, 이를 직접 측정 응답 CSV로 다시 표기하거나 덮어쓰지 않는다.</w:t>
       </w:r>
     </w:p>
     <w:p>
@@ -25079,7 +25079,7 @@
               <w:rPr>
                 <w:sz w:val="18"/>
               </w:rPr>
-              <w:t>Kᵢ는 장소의 범주 집합, J는 S4의 역사·자연·바다·음식·체험 중 해당 한 범주.</w:t>
+              <w:t>Kᵢ는 장소의 범주 집합, J는 S4 두 관심사 중 역사·자연·바다·음식·체험에 해당하는 범주 집합(0~2개).</w:t>
             </w:r>
           </w:p>
         </w:tc>
@@ -25198,7 +25198,7 @@
     </w:tbl>
     <w:p>
       <w:r>
-        <w:t>예제의 S4 역사, S3 천천히에 역사 장소 B=60, L=30, U=120, E=0을 주면 60×1.1×1.2=79.2분, 5분 단위 올림으로 80분이다. B분기 D 없음은 앞선 S4를 취소하지 않으므로 이 관심사 일치도를 자동으로 0으로 만들지 않는다.</w:t>
+        <w:t>예제의 S4 역사·자연, S3 천천히에 역사 장소 B=60, L=30, U=120, E=0을 주면 60×1.1×1.2=79.2분, 5분 단위 올림으로 80분이다. B분기 D 없음은 앞선 S4를 취소하지 않으므로 이 관심사 일치도를 자동으로 0으로 만들지 않는다.</w:t>
       </w:r>
     </w:p>
     <w:p>
@@ -25222,7 +25222,7 @@
     </w:p>
     <w:p>
       <w:r>
-        <w:t>날짜·기간·이동수단·보행·특별 조건은 C 유형 점수 없는 기존 질문이므로 현재 유형 설문에서 제거했다. 실제 일정이 필요할 때 별도 계획 설정에서 받으며, 유형 설문 응답 수 7~8개에 포함하지 않는다.</w:t>
+        <w:t>날짜·기간·이동수단·보행·특별 조건은 C 유형 점수 없는 기존 질문이므로 현재 유형 설문에서 제거했다. 실제 일정이 필요할 때 별도 계획 설정에서 받으며, 유형 설문 응답 수 7~9개에 포함하지 않는다.</w:t>
       </w:r>
     </w:p>
     <w:p>

</xml_diff>